<commit_message>
add ros2 control sample
</commit_message>
<xml_diff>
--- a/document/research-doc.docx
+++ b/document/research-doc.docx
@@ -738,129 +738,6 @@
         <w:bidi w:val="0"/>
         <w:spacing w:before="57" w:after="57"/>
         <w:jc w:val="both"/>
-        <w:rPr/>
-      </w:pPr>
-      <w:r>
-        <w:rPr/>
-      </w:r>
-    </w:p>
-    <w:p>
-      <w:pPr>
-        <w:pStyle w:val="Normal"/>
-        <w:bidi w:val="0"/>
-        <w:spacing w:before="57" w:after="57"/>
-        <w:jc w:val="both"/>
-        <w:rPr>
-          <w:rFonts w:ascii="Times New Roman" w:hAnsi="Times New Roman"/>
-        </w:rPr>
-      </w:pPr>
-      <w:r>
-        <w:rPr>
-          <w:rFonts w:ascii="Times New Roman" w:hAnsi="Times New Roman"/>
-        </w:rPr>
-      </w:r>
-    </w:p>
-    <w:p>
-      <w:pPr>
-        <w:pStyle w:val="Normal"/>
-        <w:bidi w:val="0"/>
-        <w:spacing w:before="57" w:after="57"/>
-        <w:jc w:val="both"/>
-        <w:rPr/>
-      </w:pPr>
-      <w:r>
-        <w:rPr>
-          <w:rFonts w:ascii="Times New Roman" w:hAnsi="Times New Roman"/>
-        </w:rPr>
-        <w:t xml:space="preserve"> </w:t>
-      </w:r>
-      <w:r>
-        <w:rPr>
-          <w:rFonts w:ascii="Times New Roman" w:hAnsi="Times New Roman"/>
-          <w:shd w:fill="FFFF00" w:val="clear"/>
-        </w:rPr>
-        <w:t xml:space="preserve">  </w:t>
-      </w:r>
-      <w:r>
-        <w:rPr>
-          <w:rFonts w:ascii="Times New Roman" w:hAnsi="Times New Roman"/>
-          <w:shd w:fill="FFFF00" w:val="clear"/>
-        </w:rPr>
-        <w:t>Tiếp theo cần làm:</w:t>
-      </w:r>
-    </w:p>
-    <w:p>
-      <w:pPr>
-        <w:pStyle w:val="Normal"/>
-        <w:bidi w:val="0"/>
-        <w:spacing w:before="57" w:after="57"/>
-        <w:jc w:val="both"/>
-        <w:rPr/>
-      </w:pPr>
-      <w:r>
-        <w:rPr>
-          <w:rFonts w:ascii="Times New Roman" w:hAnsi="Times New Roman"/>
-          <w:shd w:fill="FFFF00" w:val="clear"/>
-        </w:rPr>
-        <w:tab/>
-        <w:t>- Làm rõ tần số hoạt động và cơ cấu robot</w:t>
-      </w:r>
-    </w:p>
-    <w:p>
-      <w:pPr>
-        <w:pStyle w:val="Normal"/>
-        <w:bidi w:val="0"/>
-        <w:spacing w:before="57" w:after="57"/>
-        <w:jc w:val="both"/>
-        <w:rPr/>
-      </w:pPr>
-      <w:r>
-        <w:rPr>
-          <w:rFonts w:ascii="Times New Roman" w:hAnsi="Times New Roman"/>
-          <w:shd w:fill="FFFF00" w:val="clear"/>
-        </w:rPr>
-        <w:tab/>
-        <w:t>- Đọc tín hiệu từ IMU và tạo ra đúng chính xác [0:9] vector nhận được từ Robot và so sánh giá trị dữ liệu của chúng.</w:t>
-      </w:r>
-    </w:p>
-    <w:p>
-      <w:pPr>
-        <w:pStyle w:val="Normal"/>
-        <w:bidi w:val="0"/>
-        <w:spacing w:before="57" w:after="57"/>
-        <w:jc w:val="both"/>
-        <w:rPr/>
-      </w:pPr>
-      <w:r>
-        <w:rPr>
-          <w:rFonts w:ascii="Times New Roman" w:hAnsi="Times New Roman"/>
-          <w:shd w:fill="FFFF00" w:val="clear"/>
-        </w:rPr>
-        <w:tab/>
-      </w:r>
-    </w:p>
-    <w:p>
-      <w:pPr>
-        <w:pStyle w:val="Normal"/>
-        <w:bidi w:val="0"/>
-        <w:spacing w:before="57" w:after="57"/>
-        <w:jc w:val="both"/>
-        <w:rPr>
-          <w:rFonts w:ascii="Times New Roman" w:hAnsi="Times New Roman"/>
-        </w:rPr>
-      </w:pPr>
-      <w:r>
-        <w:rPr>
-          <w:rFonts w:ascii="Times New Roman" w:hAnsi="Times New Roman"/>
-        </w:rPr>
-      </w:r>
-    </w:p>
-    <w:p>
-      <w:pPr>
-        <w:pStyle w:val="Normal"/>
-        <w:bidi w:val="0"/>
-        <w:spacing w:before="57" w:after="57"/>
-        <w:jc w:val="both"/>
         <w:rPr>
           <w:rFonts w:ascii="Times New Roman" w:hAnsi="Times New Roman"/>
         </w:rPr>
@@ -955,55 +832,231 @@
         <w:rPr>
           <w:rFonts w:ascii="Times New Roman" w:hAnsi="Times New Roman"/>
         </w:rPr>
-      </w:r>
-    </w:p>
-    <w:p>
-      <w:pPr>
-        <w:pStyle w:val="Normal"/>
-        <w:bidi w:val="0"/>
-        <w:spacing w:before="57" w:after="57"/>
-        <w:jc w:val="both"/>
-        <w:rPr>
-          <w:rFonts w:ascii="Times New Roman" w:hAnsi="Times New Roman"/>
-        </w:rPr>
-      </w:pPr>
-      <w:r>
-        <w:rPr>
-          <w:rFonts w:ascii="Times New Roman" w:hAnsi="Times New Roman"/>
-        </w:rPr>
-        <w:t xml:space="preserve">   </w:t>
-      </w:r>
-    </w:p>
-    <w:p>
-      <w:pPr>
-        <w:pStyle w:val="Normal"/>
-        <w:bidi w:val="0"/>
-        <w:spacing w:before="57" w:after="57"/>
-        <w:jc w:val="both"/>
-        <w:rPr>
-          <w:rFonts w:ascii="Times New Roman" w:hAnsi="Times New Roman"/>
-        </w:rPr>
-      </w:pPr>
-      <w:r>
-        <w:rPr>
-          <w:rFonts w:ascii="Times New Roman" w:hAnsi="Times New Roman"/>
-        </w:rPr>
-      </w:r>
-    </w:p>
-    <w:p>
-      <w:pPr>
-        <w:pStyle w:val="Normal"/>
-        <w:bidi w:val="0"/>
-        <w:spacing w:before="57" w:after="57"/>
-        <w:jc w:val="both"/>
-        <w:rPr>
-          <w:rFonts w:ascii="Times New Roman" w:hAnsi="Times New Roman"/>
-        </w:rPr>
-      </w:pPr>
-      <w:r>
-        <w:rPr>
-          <w:rFonts w:ascii="Times New Roman" w:hAnsi="Times New Roman"/>
-        </w:rPr>
+        <w:t xml:space="preserve">      </w:t>
+      </w:r>
+      <w:r>
+        <w:rPr>
+          <w:rFonts w:ascii="Times New Roman" w:hAnsi="Times New Roman"/>
+        </w:rPr>
+        <w:t>Đã điều khiển được tương đối các giá trị IMU tuân theo Action Graph được mô tả</w:t>
+      </w:r>
+    </w:p>
+    <w:p>
+      <w:pPr>
+        <w:pStyle w:val="Normal"/>
+        <w:bidi w:val="0"/>
+        <w:spacing w:before="57" w:after="57"/>
+        <w:jc w:val="both"/>
+        <w:rPr>
+          <w:rFonts w:ascii="Times New Roman" w:hAnsi="Times New Roman"/>
+        </w:rPr>
+      </w:pPr>
+      <w:r>
+        <w:rPr/>
+        <w:drawing>
+          <wp:anchor behindDoc="0" distT="0" distB="0" distL="0" distR="0" simplePos="0" locked="0" layoutInCell="0" allowOverlap="1" relativeHeight="7">
+            <wp:simplePos x="0" y="0"/>
+            <wp:positionH relativeFrom="column">
+              <wp:posOffset>748665</wp:posOffset>
+            </wp:positionH>
+            <wp:positionV relativeFrom="paragraph">
+              <wp:posOffset>87630</wp:posOffset>
+            </wp:positionV>
+            <wp:extent cx="4566285" cy="3288030"/>
+            <wp:effectExtent l="0" t="0" r="0" b="0"/>
+            <wp:wrapTopAndBottom/>
+            <wp:docPr id="3" name="Image6" descr="" title=""/>
+            <wp:cNvGraphicFramePr>
+              <a:graphicFrameLocks xmlns:a="http://schemas.openxmlformats.org/drawingml/2006/main" noChangeAspect="1"/>
+            </wp:cNvGraphicFramePr>
+            <a:graphic xmlns:a="http://schemas.openxmlformats.org/drawingml/2006/main">
+              <a:graphicData uri="http://schemas.openxmlformats.org/drawingml/2006/picture">
+                <pic:pic xmlns:pic="http://schemas.openxmlformats.org/drawingml/2006/picture">
+                  <pic:nvPicPr>
+                    <pic:cNvPr id="3" name="Image6" descr="" title=""/>
+                    <pic:cNvPicPr>
+                      <a:picLocks noChangeAspect="1" noChangeArrowheads="1"/>
+                    </pic:cNvPicPr>
+                  </pic:nvPicPr>
+                  <pic:blipFill>
+                    <a:blip r:embed="rId5"/>
+                    <a:stretch>
+                      <a:fillRect/>
+                    </a:stretch>
+                  </pic:blipFill>
+                  <pic:spPr bwMode="auto">
+                    <a:xfrm>
+                      <a:off x="0" y="0"/>
+                      <a:ext cx="4566285" cy="3288030"/>
+                    </a:xfrm>
+                    <a:prstGeom prst="rect">
+                      <a:avLst/>
+                    </a:prstGeom>
+                  </pic:spPr>
+                </pic:pic>
+              </a:graphicData>
+            </a:graphic>
+          </wp:anchor>
+        </w:drawing>
+      </w:r>
+    </w:p>
+    <w:p>
+      <w:pPr>
+        <w:pStyle w:val="Normal"/>
+        <w:bidi w:val="0"/>
+        <w:spacing w:before="57" w:after="57"/>
+        <w:jc w:val="both"/>
+        <w:rPr>
+          <w:rFonts w:ascii="Times New Roman" w:hAnsi="Times New Roman"/>
+        </w:rPr>
+      </w:pPr>
+      <w:r>
+        <w:rPr>
+          <w:rFonts w:ascii="Times New Roman" w:hAnsi="Times New Roman"/>
+        </w:rPr>
+        <w:t xml:space="preserve">     </w:t>
+      </w:r>
+      <w:r>
+        <w:rPr>
+          <w:rFonts w:ascii="Times New Roman" w:hAnsi="Times New Roman"/>
+        </w:rPr>
+        <w:t>Action Grap IMU có chức năng:</w:t>
+      </w:r>
+    </w:p>
+    <w:p>
+      <w:pPr>
+        <w:pStyle w:val="BodyText"/>
+        <w:bidi w:val="0"/>
+        <w:spacing w:before="57" w:after="57"/>
+        <w:jc w:val="both"/>
+        <w:rPr>
+          <w:rFonts w:ascii="Times New Roman" w:hAnsi="Times New Roman"/>
+        </w:rPr>
+      </w:pPr>
+      <w:r>
+        <w:rPr>
+          <w:rFonts w:ascii="Times New Roman" w:hAnsi="Times New Roman"/>
+          <w:b/>
+        </w:rPr>
+        <w:tab/>
+        <w:t xml:space="preserve">On Physics Step (Kích hoạt theo bước vật lý): </w:t>
+      </w:r>
+      <w:r>
+        <w:rPr/>
+        <w:t>Node này đóng vai trò là trình kích hoạt (trigger) mỗi khi môi trường mô phỏng Isaac Sim thực hiện một bước tính toán vật lý. Nó điều khiển việc thực thi toàn bộ luồng logic (graph) một cách đồng bộ với trình mô phỏng.</w:t>
+      </w:r>
+    </w:p>
+    <w:p>
+      <w:pPr>
+        <w:pStyle w:val="BodyText"/>
+        <w:bidi w:val="0"/>
+        <w:spacing w:before="57" w:after="57"/>
+        <w:jc w:val="both"/>
+        <w:rPr>
+          <w:rFonts w:ascii="Times New Roman" w:hAnsi="Times New Roman"/>
+        </w:rPr>
+      </w:pPr>
+      <w:r>
+        <w:rPr>
+          <w:b/>
+        </w:rPr>
+        <w:tab/>
+        <w:t xml:space="preserve">ROS2 Context (Bối cảnh ROS2): </w:t>
+      </w:r>
+      <w:r>
+        <w:rPr/>
+        <w:t>Node này khởi tạo một ngữ cảnh (context) cần thiết cho các node ROS 2 hoạt động, đảm bảo việc quản lý tài nguyên và kết nối trong hệ thống ROS 2 được thiết lập đúng cách.</w:t>
+      </w:r>
+    </w:p>
+    <w:p>
+      <w:pPr>
+        <w:pStyle w:val="BodyText"/>
+        <w:bidi w:val="0"/>
+        <w:spacing w:before="57" w:after="57"/>
+        <w:jc w:val="both"/>
+        <w:rPr>
+          <w:rFonts w:ascii="Times New Roman" w:hAnsi="Times New Roman"/>
+        </w:rPr>
+      </w:pPr>
+      <w:r>
+        <w:rPr>
+          <w:b/>
+        </w:rPr>
+        <w:tab/>
+        <w:t xml:space="preserve">ROS2 QoS Profile (Cấu hình chất lượng dịch vụ ROS2): </w:t>
+      </w:r>
+      <w:r>
+        <w:rPr/>
+        <w:t>Node này dùng để thiết lập cấu hình Quality of Service (QoS) cho các node ROS 2, quy định các thông số về độ tin cậy, lịch sử dữ liệu và băng thông trong quá trình truyền nhận tin nhắn.</w:t>
+      </w:r>
+    </w:p>
+    <w:p>
+      <w:pPr>
+        <w:pStyle w:val="BodyText"/>
+        <w:bidi w:val="0"/>
+        <w:spacing w:before="57" w:after="57"/>
+        <w:jc w:val="both"/>
+        <w:rPr>
+          <w:rFonts w:ascii="Times New Roman" w:hAnsi="Times New Roman"/>
+        </w:rPr>
+      </w:pPr>
+      <w:r>
+        <w:rPr>
+          <w:b/>
+        </w:rPr>
+        <w:tab/>
+        <w:t xml:space="preserve">Isaac Read IMU Node (Đọc dữ liệu IMU từ Isaac): </w:t>
+      </w:r>
+      <w:r>
+        <w:rPr/>
+        <w:t>Thực hiện nhiệm vụ trích xuất các giá trị đo lường từ cảm biến IMU (đơn vị đo lường quán tính) trực tiếp từ môi trường mô phỏng Isaac Sim.</w:t>
+      </w:r>
+    </w:p>
+    <w:p>
+      <w:pPr>
+        <w:pStyle w:val="BodyText"/>
+        <w:bidi w:val="0"/>
+        <w:spacing w:before="57" w:after="57"/>
+        <w:jc w:val="both"/>
+        <w:rPr>
+          <w:rFonts w:ascii="Times New Roman" w:hAnsi="Times New Roman"/>
+        </w:rPr>
+      </w:pPr>
+      <w:r>
+        <w:rPr>
+          <w:b/>
+        </w:rPr>
+        <w:tab/>
+        <w:t xml:space="preserve">Isaac Read Simulation Time (Đọc thời gian mô phỏng): </w:t>
+      </w:r>
+      <w:r>
+        <w:rPr/>
+        <w:t>Truy xuất giá trị thời gian thực tế trong môi trường mô phỏng (simulation time) của Isaac Sim để phục vụ việc đồng bộ dữ liệu.</w:t>
+      </w:r>
+    </w:p>
+    <w:p>
+      <w:pPr>
+        <w:pStyle w:val="BodyText"/>
+        <w:bidi w:val="0"/>
+        <w:spacing w:before="57" w:after="57"/>
+        <w:jc w:val="both"/>
+        <w:rPr>
+          <w:rFonts w:ascii="Times New Roman" w:hAnsi="Times New Roman"/>
+        </w:rPr>
+      </w:pPr>
+      <w:r>
+        <w:rPr>
+          <w:b/>
+        </w:rPr>
+        <w:tab/>
+        <w:t xml:space="preserve">ROS2 Publish IMU (Xuất bản dữ liệu IMU lên ROS2): </w:t>
+      </w:r>
+      <w:r>
+        <w:rPr>
+          <w:b w:val="false"/>
+          <w:bCs w:val="false"/>
+        </w:rPr>
+        <w:t>Node này thực hiện việc gửi (publish) dữ liệu IMU lên hệ thống ROS 2. Dữ liệu đầu vào được tổng hợp từ hai nguồn chính là Isaac Read IMU Node (nội dung dữ liệu) và Isaac Read Simulation Time (mốc thời gian tương ứng).</w:t>
       </w:r>
     </w:p>
     <w:p>
@@ -1138,7 +1191,7 @@
         <w:jc w:val="both"/>
         <w:rPr/>
       </w:pPr>
-      <w:hyperlink r:id="rId5">
+      <w:hyperlink r:id="rId6">
         <w:r>
           <w:rPr>
             <w:rStyle w:val="Hyperlink"/>
@@ -1174,7 +1227,7 @@
             <wp:extent cx="4463415" cy="3049905"/>
             <wp:effectExtent l="0" t="0" r="0" b="0"/>
             <wp:wrapTopAndBottom/>
-            <wp:docPr id="3" name="Image3" descr="" title=""/>
+            <wp:docPr id="4" name="Image3" descr="" title=""/>
             <wp:cNvGraphicFramePr>
               <a:graphicFrameLocks xmlns:a="http://schemas.openxmlformats.org/drawingml/2006/main" noChangeAspect="1"/>
             </wp:cNvGraphicFramePr>
@@ -1182,13 +1235,13 @@
               <a:graphicData uri="http://schemas.openxmlformats.org/drawingml/2006/picture">
                 <pic:pic xmlns:pic="http://schemas.openxmlformats.org/drawingml/2006/picture">
                   <pic:nvPicPr>
-                    <pic:cNvPr id="3" name="Image3" descr="" title=""/>
+                    <pic:cNvPr id="4" name="Image3" descr="" title=""/>
                     <pic:cNvPicPr>
                       <a:picLocks noChangeAspect="1" noChangeArrowheads="1"/>
                     </pic:cNvPicPr>
                   </pic:nvPicPr>
                   <pic:blipFill>
-                    <a:blip r:embed="rId6"/>
+                    <a:blip r:embed="rId7"/>
                     <a:stretch>
                       <a:fillRect/>
                     </a:stretch>
@@ -1405,7 +1458,7 @@
             <wp:extent cx="5038725" cy="3223260"/>
             <wp:effectExtent l="0" t="0" r="0" b="0"/>
             <wp:wrapTopAndBottom/>
-            <wp:docPr id="4" name="Image4" descr="" title=""/>
+            <wp:docPr id="5" name="Image4" descr="" title=""/>
             <wp:cNvGraphicFramePr>
               <a:graphicFrameLocks xmlns:a="http://schemas.openxmlformats.org/drawingml/2006/main" noChangeAspect="1"/>
             </wp:cNvGraphicFramePr>
@@ -1413,13 +1466,13 @@
               <a:graphicData uri="http://schemas.openxmlformats.org/drawingml/2006/picture">
                 <pic:pic xmlns:pic="http://schemas.openxmlformats.org/drawingml/2006/picture">
                   <pic:nvPicPr>
-                    <pic:cNvPr id="4" name="Image4" descr="" title=""/>
+                    <pic:cNvPr id="5" name="Image4" descr="" title=""/>
                     <pic:cNvPicPr>
                       <a:picLocks noChangeAspect="1" noChangeArrowheads="1"/>
                     </pic:cNvPicPr>
                   </pic:nvPicPr>
                   <pic:blipFill>
-                    <a:blip r:embed="rId7"/>
+                    <a:blip r:embed="rId8"/>
                     <a:stretch>
                       <a:fillRect/>
                     </a:stretch>
@@ -1489,7 +1542,7 @@
             <wp:extent cx="6332220" cy="1954530"/>
             <wp:effectExtent l="0" t="0" r="0" b="0"/>
             <wp:wrapTopAndBottom/>
-            <wp:docPr id="5" name="Image5" descr="" title=""/>
+            <wp:docPr id="6" name="Image5" descr="" title=""/>
             <wp:cNvGraphicFramePr>
               <a:graphicFrameLocks xmlns:a="http://schemas.openxmlformats.org/drawingml/2006/main" noChangeAspect="1"/>
             </wp:cNvGraphicFramePr>
@@ -1497,13 +1550,13 @@
               <a:graphicData uri="http://schemas.openxmlformats.org/drawingml/2006/picture">
                 <pic:pic xmlns:pic="http://schemas.openxmlformats.org/drawingml/2006/picture">
                   <pic:nvPicPr>
-                    <pic:cNvPr id="5" name="Image5" descr="" title=""/>
+                    <pic:cNvPr id="6" name="Image5" descr="" title=""/>
                     <pic:cNvPicPr>
                       <a:picLocks noChangeAspect="1" noChangeArrowheads="1"/>
                     </pic:cNvPicPr>
                   </pic:nvPicPr>
                   <pic:blipFill>
-                    <a:blip r:embed="rId8"/>
+                    <a:blip r:embed="rId9"/>
                     <a:stretch>
                       <a:fillRect/>
                     </a:stretch>

</xml_diff>

<commit_message>
add results H1 control ros2&isaac
</commit_message>
<xml_diff>
--- a/document/research-doc.docx
+++ b/document/research-doc.docx
@@ -852,7 +852,9 @@
         </w:rPr>
       </w:pPr>
       <w:r>
-        <w:rPr/>
+        <w:rPr>
+          <w:rFonts w:ascii="Times New Roman" w:hAnsi="Times New Roman"/>
+        </w:rPr>
         <w:drawing>
           <wp:anchor behindDoc="0" distT="0" distB="0" distL="0" distR="0" simplePos="0" locked="0" layoutInCell="0" allowOverlap="1" relativeHeight="7">
             <wp:simplePos x="0" y="0"/>
@@ -1391,7 +1393,7 @@
         <w:rPr>
           <w:rFonts w:ascii="Times New Roman" w:hAnsi="Times New Roman"/>
         </w:rPr>
-        <w:t>Áp dụng action lên robot trong Isaac Sim</w:t>
+        <w:t>Áp dụng action lên robot trong Isaac Sim qua API trực tiếp lên khớp.</w:t>
       </w:r>
     </w:p>
     <w:p>
@@ -1585,12 +1587,254 @@
         <w:jc w:val="both"/>
         <w:rPr>
           <w:rFonts w:ascii="Times New Roman" w:hAnsi="Times New Roman"/>
-        </w:rPr>
-      </w:pPr>
-      <w:r>
-        <w:rPr>
-          <w:rFonts w:ascii="Times New Roman" w:hAnsi="Times New Roman"/>
-        </w:rPr>
+          <w:b/>
+          <w:bCs/>
+        </w:rPr>
+      </w:pPr>
+      <w:r>
+        <w:rPr>
+          <w:rFonts w:ascii="Times New Roman" w:hAnsi="Times New Roman"/>
+          <w:b/>
+          <w:bCs/>
+        </w:rPr>
+      </w:r>
+    </w:p>
+    <w:p>
+      <w:pPr>
+        <w:pStyle w:val="Normal"/>
+        <w:bidi w:val="0"/>
+        <w:spacing w:before="57" w:after="57"/>
+        <w:jc w:val="both"/>
+        <w:rPr>
+          <w:rFonts w:ascii="Times New Roman" w:hAnsi="Times New Roman"/>
+          <w:b/>
+          <w:bCs/>
+        </w:rPr>
+      </w:pPr>
+      <w:r>
+        <w:rPr>
+          <w:rFonts w:ascii="Times New Roman" w:hAnsi="Times New Roman"/>
+          <w:b/>
+          <w:bCs/>
+        </w:rPr>
+        <w:t>3.2 Điều khiển từ ROS2</w:t>
+      </w:r>
+    </w:p>
+    <w:p>
+      <w:pPr>
+        <w:pStyle w:val="Normal"/>
+        <w:bidi w:val="0"/>
+        <w:spacing w:before="57" w:after="57"/>
+        <w:jc w:val="both"/>
+        <w:rPr>
+          <w:rFonts w:ascii="Times New Roman" w:hAnsi="Times New Roman"/>
+        </w:rPr>
+      </w:pPr>
+      <w:r>
+        <w:rPr>
+          <w:rFonts w:ascii="Times New Roman" w:hAnsi="Times New Roman"/>
+        </w:rPr>
+        <w:t xml:space="preserve">     </w:t>
+      </w:r>
+      <w:r>
+        <w:rPr>
+          <w:rFonts w:ascii="Times New Roman" w:hAnsi="Times New Roman"/>
+        </w:rPr>
+        <w:t>Policy điều khiển RL có dạng:</w:t>
+      </w:r>
+    </w:p>
+    <w:p>
+      <w:pPr>
+        <w:pStyle w:val="Normal"/>
+        <w:bidi w:val="0"/>
+        <w:spacing w:before="57" w:after="57"/>
+        <w:jc w:val="both"/>
+        <w:rPr>
+          <w:rFonts w:ascii="Times New Roman" w:hAnsi="Times New Roman"/>
+        </w:rPr>
+      </w:pPr>
+      <w:r>
+        <w:rPr>
+          <w:rFonts w:ascii="Times New Roman" w:hAnsi="Times New Roman"/>
+        </w:rPr>
+      </w:r>
+    </w:p>
+    <w:p>
+      <w:pPr>
+        <w:pStyle w:val="Normal"/>
+        <w:bidi w:val="0"/>
+        <w:spacing w:before="57" w:after="57"/>
+        <w:jc w:val="both"/>
+        <w:rPr>
+          <w:rFonts w:ascii="Times New Roman" w:hAnsi="Times New Roman"/>
+        </w:rPr>
+      </w:pPr>
+      <w:r>
+        <w:rPr>
+          <w:rFonts w:ascii="Times New Roman" w:hAnsi="Times New Roman"/>
+        </w:rPr>
+      </w:r>
+    </w:p>
+    <w:p>
+      <w:pPr>
+        <w:pStyle w:val="Normal"/>
+        <w:bidi w:val="0"/>
+        <w:spacing w:before="57" w:after="57"/>
+        <w:jc w:val="both"/>
+        <w:rPr>
+          <w:rFonts w:ascii="Times New Roman" w:hAnsi="Times New Roman"/>
+        </w:rPr>
+      </w:pPr>
+      <w:r>
+        <w:rPr>
+          <w:rFonts w:ascii="Times New Roman" w:hAnsi="Times New Roman"/>
+        </w:rPr>
+      </w:r>
+    </w:p>
+    <w:p>
+      <w:pPr>
+        <w:pStyle w:val="Normal"/>
+        <w:bidi w:val="0"/>
+        <w:spacing w:before="57" w:after="57"/>
+        <w:jc w:val="both"/>
+        <w:rPr>
+          <w:rFonts w:ascii="Times New Roman" w:hAnsi="Times New Roman"/>
+        </w:rPr>
+      </w:pPr>
+      <w:r>
+        <w:rPr>
+          <w:rFonts w:ascii="Times New Roman" w:hAnsi="Times New Roman"/>
+        </w:rPr>
+        <w:drawing>
+          <wp:anchor behindDoc="0" distT="0" distB="0" distL="0" distR="0" simplePos="0" locked="0" layoutInCell="0" allowOverlap="1" relativeHeight="8">
+            <wp:simplePos x="0" y="0"/>
+            <wp:positionH relativeFrom="column">
+              <wp:posOffset>828040</wp:posOffset>
+            </wp:positionH>
+            <wp:positionV relativeFrom="paragraph">
+              <wp:posOffset>121285</wp:posOffset>
+            </wp:positionV>
+            <wp:extent cx="4310380" cy="2035810"/>
+            <wp:effectExtent l="0" t="0" r="0" b="0"/>
+            <wp:wrapTopAndBottom/>
+            <wp:docPr id="7" name="Image7" descr="" title=""/>
+            <wp:cNvGraphicFramePr>
+              <a:graphicFrameLocks xmlns:a="http://schemas.openxmlformats.org/drawingml/2006/main" noChangeAspect="1"/>
+            </wp:cNvGraphicFramePr>
+            <a:graphic xmlns:a="http://schemas.openxmlformats.org/drawingml/2006/main">
+              <a:graphicData uri="http://schemas.openxmlformats.org/drawingml/2006/picture">
+                <pic:pic xmlns:pic="http://schemas.openxmlformats.org/drawingml/2006/picture">
+                  <pic:nvPicPr>
+                    <pic:cNvPr id="7" name="Image7" descr="" title=""/>
+                    <pic:cNvPicPr>
+                      <a:picLocks noChangeAspect="1" noChangeArrowheads="1"/>
+                    </pic:cNvPicPr>
+                  </pic:nvPicPr>
+                  <pic:blipFill>
+                    <a:blip r:embed="rId10"/>
+                    <a:srcRect l="8485" t="17313" r="8690" b="13086"/>
+                    <a:stretch>
+                      <a:fillRect/>
+                    </a:stretch>
+                  </pic:blipFill>
+                  <pic:spPr bwMode="auto">
+                    <a:xfrm>
+                      <a:off x="0" y="0"/>
+                      <a:ext cx="4310380" cy="2035810"/>
+                    </a:xfrm>
+                    <a:prstGeom prst="rect">
+                      <a:avLst/>
+                    </a:prstGeom>
+                  </pic:spPr>
+                </pic:pic>
+              </a:graphicData>
+            </a:graphic>
+          </wp:anchor>
+        </w:drawing>
+      </w:r>
+    </w:p>
+    <w:p>
+      <w:pPr>
+        <w:pStyle w:val="Normal"/>
+        <w:bidi w:val="0"/>
+        <w:spacing w:before="57" w:after="57"/>
+        <w:jc w:val="both"/>
+        <w:rPr>
+          <w:rFonts w:ascii="Times New Roman" w:hAnsi="Times New Roman"/>
+        </w:rPr>
+      </w:pPr>
+      <w:r>
+        <w:rPr>
+          <w:rFonts w:ascii="Times New Roman" w:hAnsi="Times New Roman"/>
+        </w:rPr>
+        <w:t xml:space="preserve">   </w:t>
+      </w:r>
+      <w:r>
+        <w:rPr>
+          <w:rFonts w:ascii="Times New Roman" w:hAnsi="Times New Roman"/>
+        </w:rPr>
+        <w:t>Cấu trúc điều khiển policy của H1 có dạng:</w:t>
+      </w:r>
+    </w:p>
+    <w:p>
+      <w:pPr>
+        <w:pStyle w:val="Normal"/>
+        <w:bidi w:val="0"/>
+        <w:spacing w:before="57" w:after="57"/>
+        <w:jc w:val="both"/>
+        <w:rPr>
+          <w:rFonts w:ascii="Times New Roman" w:hAnsi="Times New Roman"/>
+        </w:rPr>
+      </w:pPr>
+      <w:r>
+        <w:rPr>
+          <w:rFonts w:ascii="Times New Roman" w:hAnsi="Times New Roman"/>
+        </w:rPr>
+        <w:drawing>
+          <wp:anchor behindDoc="0" distT="0" distB="0" distL="0" distR="0" simplePos="0" locked="0" layoutInCell="0" allowOverlap="1" relativeHeight="9">
+            <wp:simplePos x="0" y="0"/>
+            <wp:positionH relativeFrom="column">
+              <wp:posOffset>0</wp:posOffset>
+            </wp:positionH>
+            <wp:positionV relativeFrom="paragraph">
+              <wp:posOffset>119380</wp:posOffset>
+            </wp:positionV>
+            <wp:extent cx="6332220" cy="2425065"/>
+            <wp:effectExtent l="0" t="0" r="0" b="0"/>
+            <wp:wrapSquare wrapText="largest"/>
+            <wp:docPr id="8" name="Image8" descr="" title=""/>
+            <wp:cNvGraphicFramePr>
+              <a:graphicFrameLocks xmlns:a="http://schemas.openxmlformats.org/drawingml/2006/main" noChangeAspect="1"/>
+            </wp:cNvGraphicFramePr>
+            <a:graphic xmlns:a="http://schemas.openxmlformats.org/drawingml/2006/main">
+              <a:graphicData uri="http://schemas.openxmlformats.org/drawingml/2006/picture">
+                <pic:pic xmlns:pic="http://schemas.openxmlformats.org/drawingml/2006/picture">
+                  <pic:nvPicPr>
+                    <pic:cNvPr id="8" name="Image8" descr="" title=""/>
+                    <pic:cNvPicPr>
+                      <a:picLocks noChangeAspect="1" noChangeArrowheads="1"/>
+                    </pic:cNvPicPr>
+                  </pic:nvPicPr>
+                  <pic:blipFill>
+                    <a:blip r:embed="rId11"/>
+                    <a:stretch>
+                      <a:fillRect/>
+                    </a:stretch>
+                  </pic:blipFill>
+                  <pic:spPr bwMode="auto">
+                    <a:xfrm>
+                      <a:off x="0" y="0"/>
+                      <a:ext cx="6332220" cy="2425065"/>
+                    </a:xfrm>
+                    <a:prstGeom prst="rect">
+                      <a:avLst/>
+                    </a:prstGeom>
+                  </pic:spPr>
+                </pic:pic>
+              </a:graphicData>
+            </a:graphic>
+          </wp:anchor>
+        </w:drawing>
       </w:r>
     </w:p>
     <w:p>
@@ -1710,6 +1954,70 @@
         <w:bidi w:val="0"/>
         <w:spacing w:before="57" w:after="57"/>
         <w:jc w:val="both"/>
+        <w:rPr>
+          <w:rFonts w:ascii="Times New Roman" w:hAnsi="Times New Roman"/>
+        </w:rPr>
+      </w:pPr>
+      <w:r>
+        <w:rPr>
+          <w:rFonts w:ascii="Times New Roman" w:hAnsi="Times New Roman"/>
+        </w:rPr>
+      </w:r>
+    </w:p>
+    <w:p>
+      <w:pPr>
+        <w:pStyle w:val="Normal"/>
+        <w:bidi w:val="0"/>
+        <w:spacing w:before="57" w:after="57"/>
+        <w:jc w:val="both"/>
+        <w:rPr>
+          <w:rFonts w:ascii="Times New Roman" w:hAnsi="Times New Roman"/>
+        </w:rPr>
+      </w:pPr>
+      <w:r>
+        <w:rPr>
+          <w:rFonts w:ascii="Times New Roman" w:hAnsi="Times New Roman"/>
+        </w:rPr>
+      </w:r>
+    </w:p>
+    <w:p>
+      <w:pPr>
+        <w:pStyle w:val="Normal"/>
+        <w:bidi w:val="0"/>
+        <w:spacing w:before="57" w:after="57"/>
+        <w:jc w:val="both"/>
+        <w:rPr>
+          <w:rFonts w:ascii="Times New Roman" w:hAnsi="Times New Roman"/>
+        </w:rPr>
+      </w:pPr>
+      <w:r>
+        <w:rPr>
+          <w:rFonts w:ascii="Times New Roman" w:hAnsi="Times New Roman"/>
+        </w:rPr>
+      </w:r>
+    </w:p>
+    <w:p>
+      <w:pPr>
+        <w:pStyle w:val="Normal"/>
+        <w:bidi w:val="0"/>
+        <w:spacing w:before="57" w:after="57"/>
+        <w:jc w:val="both"/>
+        <w:rPr>
+          <w:rFonts w:ascii="Times New Roman" w:hAnsi="Times New Roman"/>
+        </w:rPr>
+      </w:pPr>
+      <w:r>
+        <w:rPr>
+          <w:rFonts w:ascii="Times New Roman" w:hAnsi="Times New Roman"/>
+        </w:rPr>
+      </w:r>
+    </w:p>
+    <w:p>
+      <w:pPr>
+        <w:pStyle w:val="Normal"/>
+        <w:bidi w:val="0"/>
+        <w:spacing w:before="57" w:after="57"/>
+        <w:jc w:val="both"/>
         <w:rPr/>
       </w:pPr>
       <w:r>
@@ -1757,6 +2065,54 @@
         <w:bidi w:val="0"/>
         <w:spacing w:before="57" w:after="57"/>
         <w:jc w:val="both"/>
+        <w:rPr>
+          <w:rFonts w:ascii="Times New Roman" w:hAnsi="Times New Roman"/>
+        </w:rPr>
+      </w:pPr>
+      <w:r>
+        <w:rPr>
+          <w:rFonts w:ascii="Times New Roman" w:hAnsi="Times New Roman"/>
+        </w:rPr>
+      </w:r>
+    </w:p>
+    <w:p>
+      <w:pPr>
+        <w:pStyle w:val="Normal"/>
+        <w:bidi w:val="0"/>
+        <w:spacing w:before="57" w:after="57"/>
+        <w:jc w:val="both"/>
+        <w:rPr>
+          <w:rFonts w:ascii="Times New Roman" w:hAnsi="Times New Roman"/>
+        </w:rPr>
+      </w:pPr>
+      <w:r>
+        <w:rPr>
+          <w:rFonts w:ascii="Times New Roman" w:hAnsi="Times New Roman"/>
+        </w:rPr>
+      </w:r>
+    </w:p>
+    <w:p>
+      <w:pPr>
+        <w:pStyle w:val="Normal"/>
+        <w:bidi w:val="0"/>
+        <w:spacing w:before="57" w:after="57"/>
+        <w:jc w:val="both"/>
+        <w:rPr>
+          <w:rFonts w:ascii="Times New Roman" w:hAnsi="Times New Roman"/>
+        </w:rPr>
+      </w:pPr>
+      <w:r>
+        <w:rPr>
+          <w:rFonts w:ascii="Times New Roman" w:hAnsi="Times New Roman"/>
+        </w:rPr>
+      </w:r>
+    </w:p>
+    <w:p>
+      <w:pPr>
+        <w:pStyle w:val="Normal"/>
+        <w:bidi w:val="0"/>
+        <w:spacing w:before="57" w:after="57"/>
+        <w:jc w:val="both"/>
         <w:rPr/>
       </w:pPr>
       <w:r>
@@ -1804,6 +2160,54 @@
         <w:bidi w:val="0"/>
         <w:spacing w:before="57" w:after="57"/>
         <w:jc w:val="both"/>
+        <w:rPr>
+          <w:rFonts w:ascii="Times New Roman" w:hAnsi="Times New Roman"/>
+        </w:rPr>
+      </w:pPr>
+      <w:r>
+        <w:rPr>
+          <w:rFonts w:ascii="Times New Roman" w:hAnsi="Times New Roman"/>
+        </w:rPr>
+      </w:r>
+    </w:p>
+    <w:p>
+      <w:pPr>
+        <w:pStyle w:val="Normal"/>
+        <w:bidi w:val="0"/>
+        <w:spacing w:before="57" w:after="57"/>
+        <w:jc w:val="both"/>
+        <w:rPr>
+          <w:rFonts w:ascii="Times New Roman" w:hAnsi="Times New Roman"/>
+        </w:rPr>
+      </w:pPr>
+      <w:r>
+        <w:rPr>
+          <w:rFonts w:ascii="Times New Roman" w:hAnsi="Times New Roman"/>
+        </w:rPr>
+      </w:r>
+    </w:p>
+    <w:p>
+      <w:pPr>
+        <w:pStyle w:val="Normal"/>
+        <w:bidi w:val="0"/>
+        <w:spacing w:before="57" w:after="57"/>
+        <w:jc w:val="both"/>
+        <w:rPr>
+          <w:rFonts w:ascii="Times New Roman" w:hAnsi="Times New Roman"/>
+        </w:rPr>
+      </w:pPr>
+      <w:r>
+        <w:rPr>
+          <w:rFonts w:ascii="Times New Roman" w:hAnsi="Times New Roman"/>
+        </w:rPr>
+      </w:r>
+    </w:p>
+    <w:p>
+      <w:pPr>
+        <w:pStyle w:val="Normal"/>
+        <w:bidi w:val="0"/>
+        <w:spacing w:before="57" w:after="57"/>
+        <w:jc w:val="both"/>
         <w:rPr/>
       </w:pPr>
       <w:r>
@@ -1811,6 +2215,54 @@
           <w:rFonts w:ascii="Times New Roman" w:hAnsi="Times New Roman"/>
         </w:rPr>
         <w:t>7. Deploy các AI model khác vào hệ thống</w:t>
+      </w:r>
+    </w:p>
+    <w:p>
+      <w:pPr>
+        <w:pStyle w:val="Normal"/>
+        <w:bidi w:val="0"/>
+        <w:spacing w:before="57" w:after="57"/>
+        <w:jc w:val="both"/>
+        <w:rPr>
+          <w:rFonts w:ascii="Times New Roman" w:hAnsi="Times New Roman"/>
+        </w:rPr>
+      </w:pPr>
+      <w:r>
+        <w:rPr>
+          <w:rFonts w:ascii="Times New Roman" w:hAnsi="Times New Roman"/>
+        </w:rPr>
+      </w:r>
+    </w:p>
+    <w:p>
+      <w:pPr>
+        <w:pStyle w:val="Normal"/>
+        <w:bidi w:val="0"/>
+        <w:spacing w:before="57" w:after="57"/>
+        <w:jc w:val="both"/>
+        <w:rPr>
+          <w:rFonts w:ascii="Times New Roman" w:hAnsi="Times New Roman"/>
+        </w:rPr>
+      </w:pPr>
+      <w:r>
+        <w:rPr>
+          <w:rFonts w:ascii="Times New Roman" w:hAnsi="Times New Roman"/>
+        </w:rPr>
+      </w:r>
+    </w:p>
+    <w:p>
+      <w:pPr>
+        <w:pStyle w:val="Normal"/>
+        <w:bidi w:val="0"/>
+        <w:spacing w:before="57" w:after="57"/>
+        <w:jc w:val="both"/>
+        <w:rPr>
+          <w:rFonts w:ascii="Times New Roman" w:hAnsi="Times New Roman"/>
+        </w:rPr>
+      </w:pPr>
+      <w:r>
+        <w:rPr>
+          <w:rFonts w:ascii="Times New Roman" w:hAnsi="Times New Roman"/>
+        </w:rPr>
       </w:r>
     </w:p>
     <w:p>

</xml_diff>